<commit_message>
Preços: 30 dias do Carro e do Pickup a $25; Motorizada mantém $15
Decisão do Simão a 05/10/2026. Os pacotes de 3 e 10 dias não mudam. O
preço está nos termos do motorista (pt, tet, en, página pública e Word),
por isso a versão sobe para 2026-10-05 e os motoristas voltam a aceitar —
durante o período gratuito, sem custo para ninguém. O ecrã Ganhos e o da
Assinatura lêem o preço da tabela do servidor.

Co-Authored-By: Claude Opus 5.5 <noreply@anthropic.com>
</commit_message>
<xml_diff>
--- a/juridico/app/Termos do Motorista.docx
+++ b/juridico/app/Termos do Motorista.docx
@@ -34,7 +34,7 @@
           <w:sz w:val="17"/>
           <w:szCs w:val="17"/>
         </w:rPr>
-        <w:t xml:space="preserve">Texto em vigor na aplicação, versão 2026-09-28  ·  para revisão</w:t>
+        <w:t xml:space="preserve">Texto em vigor na aplicação, versão 2026-10-05  ·  para revisão</w:t>
       </w:r>
     </w:p>
     <w:p>
@@ -562,7 +562,7 @@
                 <w:sz w:val="19"/>
                 <w:szCs w:val="19"/>
               </w:rPr>
-              <w:t xml:space="preserve">Versão de 28 de Setembro de 2026</w:t>
+              <w:t xml:space="preserve">Versão de 5 de Outubro de 2026</w:t>
             </w:r>
           </w:p>
         </w:tc>
@@ -606,7 +606,7 @@
                 <w:sz w:val="19"/>
                 <w:szCs w:val="19"/>
               </w:rPr>
-              <w:t xml:space="preserve">Versaun 28 Setembru 2026</w:t>
+              <w:t xml:space="preserve">Versaun 5 Outubru 2026</w:t>
             </w:r>
           </w:p>
         </w:tc>
@@ -650,7 +650,7 @@
                 <w:sz w:val="19"/>
                 <w:szCs w:val="19"/>
               </w:rPr>
-              <w:t xml:space="preserve">Version of 28 September 2026</w:t>
+              <w:t xml:space="preserve">Version of 5 October 2026</w:t>
             </w:r>
           </w:p>
         </w:tc>
@@ -1427,7 +1427,7 @@
                 <w:sz w:val="19"/>
                 <w:szCs w:val="19"/>
               </w:rPr>
-              <w:t xml:space="preserve">• Carro e Carro Pickup: 3 dias – $4; 10 dias – $12; 30 dias – $30.</w:t>
+              <w:t xml:space="preserve">• Carro e Carro Pickup: 3 dias – $4; 10 dias – $12; 30 dias – $25.</w:t>
             </w:r>
           </w:p>
           <w:p>
@@ -1739,7 +1739,7 @@
                 <w:sz w:val="19"/>
                 <w:szCs w:val="19"/>
               </w:rPr>
-              <w:t xml:space="preserve">• Kareta no Kareta Pickup: loron 3 – $4; loron 10 – $12; loron 30 – $30.</w:t>
+              <w:t xml:space="preserve">• Kareta no Kareta Pickup: loron 3 – $4; loron 10 – $12; loron 30 – $25.</w:t>
             </w:r>
           </w:p>
           <w:p>
@@ -2026,7 +2026,7 @@
                 <w:sz w:val="19"/>
                 <w:szCs w:val="19"/>
               </w:rPr>
-              <w:t xml:space="preserve">• Car and Pickup: 3 days – $4; 10 days – $12; 30 days – $30.</w:t>
+              <w:t xml:space="preserve">• Car and Pickup: 3 days – $4; 10 days – $12; 30 days – $25.</w:t>
             </w:r>
           </w:p>
           <w:p>
@@ -4334,7 +4334,7 @@
         <w:sz w:val="15"/>
         <w:szCs w:val="15"/>
       </w:rPr>
-      <w:t xml:space="preserve">Termos do Motorista  ·  versão na app 2026-09-28  ·  página </w:t>
+      <w:t xml:space="preserve">Termos do Motorista  ·  versão na app 2026-10-05  ·  página </w:t>
     </w:r>
     <w:r>
       <w:rPr>

</xml_diff>

<commit_message>
Política de cancelamentos: 2 min de graça, aviso aos 3 tardios, suspensão de 24 h aos 5; motorista espera 5 min antes de «não apareceu»
Servidor (cancelamentos.js, ensaio no verificar), app (avisos e textos), Termos
do Passageiro e do Motorista (versões 2026-10-10) e Word regenerados.

Co-Authored-By: Claude Opus 5.5 <noreply@anthropic.com>
</commit_message>
<xml_diff>
--- a/juridico/app/Termos do Motorista.docx
+++ b/juridico/app/Termos do Motorista.docx
@@ -34,7 +34,7 @@
           <w:sz w:val="17"/>
           <w:szCs w:val="17"/>
         </w:rPr>
-        <w:t xml:space="preserve">Texto em vigor na aplicação, versão 2026-10-05b  ·  para revisão</w:t>
+        <w:t xml:space="preserve">Texto em vigor na aplicação, versão 2026-10-10  ·  para revisão</w:t>
       </w:r>
     </w:p>
     <w:p>
@@ -4097,7 +4097,28 @@
                 <w:sz w:val="19"/>
                 <w:szCs w:val="19"/>
               </w:rPr>
-              <w:t xml:space="preserve">O cancelamento sistemático ou injustificado após aceitação pode originar a suspensão temporária ou definitiva do acesso à plataforma.</w:t>
+              <w:t xml:space="preserve">Passageiro que não aparece. Depois de tocar em «Cheguei», o motorista espera 5 minutos no local de recolha. Passado esse tempo, pode cancelar com o motivo «passageiro não apareceu», sem que isso conte contra ele. Antes dos 5 minutos, a aplicação não aceita este motivo.</w:t>
+            </w:r>
+          </w:p>
+          <w:p>
+            <w:pPr>
+              <w:spacing w:after="40" w:line="264"/>
+            </w:pPr>
+          </w:p>
+          <w:p>
+            <w:pPr>
+              <w:spacing w:after="40" w:line="264"/>
+            </w:pPr>
+            <w:r>
+              <w:rPr>
+                <w:rFonts w:ascii="Calibri" w:cs="Calibri" w:eastAsia="Calibri" w:hAnsi="Calibri"/>
+                <w:b w:val="false"/>
+                <w:bCs w:val="false"/>
+                <w:color w:val="14201D"/>
+                <w:sz w:val="19"/>
+                <w:szCs w:val="19"/>
+              </w:rPr>
+              <w:t xml:space="preserve">O cancelamento sistemático ou injustificado após aceitação pode originar a suspensão temporária ou definitiva do acesso à plataforma, nos termos da Tabela de Infrações e Sanções.</w:t>
             </w:r>
           </w:p>
         </w:tc>
@@ -4156,7 +4177,23 @@
                 <w:sz w:val="19"/>
                 <w:szCs w:val="19"/>
               </w:rPr>
-              <w:t xml:space="preserve">Kanselamentu sistemátiku/tutuir malu ka lahó justifikasaun bainhira simu tiha ona pedidu bele hamosu suspensaun temporária ka definitiva hodi asesu ba plataforma.</w:t>
+              <w:t xml:space="preserve">Pasajeiru ne’ebé la mai. Depois toka «Ha’u to’o ona», motorista hein minutu 5 iha fatin foti nian. Liu tempu ne’e, nia bele kansela ho motivu «pasajeiru la mai», no ida-ne’e la konta hasoru nia. Antes minutu 5, aplikasaun la simu motivu ne’e.</w:t>
+            </w:r>
+          </w:p>
+          <w:p>
+            <w:pPr>
+              <w:spacing w:after="40" w:line="264"/>
+            </w:pPr>
+            <w:r>
+              <w:rPr>
+                <w:rFonts w:ascii="Calibri" w:cs="Calibri" w:eastAsia="Calibri" w:hAnsi="Calibri"/>
+                <w:b w:val="false"/>
+                <w:bCs w:val="false"/>
+                <w:color w:val="14201D"/>
+                <w:sz w:val="19"/>
+                <w:szCs w:val="19"/>
+              </w:rPr>
+              <w:t xml:space="preserve">Kanselamentu sistemátiku/tutuir malu ka lahó justifikasaun bainhira simu tiha ona pedidu bele hamosu suspensaun temporária ka definitiva hodi asesu ba plataforma, tuir Tabela Infrasaun no Sansaun.</w:t>
             </w:r>
           </w:p>
         </w:tc>
@@ -4220,7 +4257,28 @@
                 <w:sz w:val="19"/>
                 <w:szCs w:val="19"/>
               </w:rPr>
-              <w:t xml:space="preserve">Systematic or unjustified cancellation after acceptance may result in the temporary or permanent suspension of access to the platform.</w:t>
+              <w:t xml:space="preserve">Passenger no-show. After tapping «I’ve arrived», the driver waits 5 minutes at the pick-up point. After that time, they may cancel with the reason «passenger did not show up», and it does not count against them. Before the 5 minutes, the application does not accept this reason.</w:t>
+            </w:r>
+          </w:p>
+          <w:p>
+            <w:pPr>
+              <w:spacing w:after="40" w:line="264"/>
+            </w:pPr>
+          </w:p>
+          <w:p>
+            <w:pPr>
+              <w:spacing w:after="40" w:line="264"/>
+            </w:pPr>
+            <w:r>
+              <w:rPr>
+                <w:rFonts w:ascii="Calibri" w:cs="Calibri" w:eastAsia="Calibri" w:hAnsi="Calibri"/>
+                <w:b w:val="false"/>
+                <w:bCs w:val="false"/>
+                <w:color w:val="14201D"/>
+                <w:sz w:val="19"/>
+                <w:szCs w:val="19"/>
+              </w:rPr>
+              <w:t xml:space="preserve">Systematic or unjustified cancellation after acceptance may result in the temporary or permanent suspension of access to the platform, under the Table of Infractions and Sanctions.</w:t>
             </w:r>
           </w:p>
         </w:tc>
@@ -4914,7 +4972,7 @@
         <w:sz w:val="15"/>
         <w:szCs w:val="15"/>
       </w:rPr>
-      <w:t xml:space="preserve">Termos do Motorista  ·  versão na app 2026-10-05b  ·  página </w:t>
+      <w:t xml:space="preserve">Termos do Motorista  ·  versão na app 2026-10-10  ·  página </w:t>
     </w:r>
     <w:r>
       <w:rPr>

</xml_diff>